<commit_message>
Article 1 v7: bibliography verified against Crossref
- Farge 1992 pages 395-458 (Crossref; the earlier change to 457 was wrong).
- Bolgiani et al. 2022: full ten-author list (journal rule: all authors up
  to 15, first three + et al. beyond); MAX_ALL_AUTHORS = 15.
- Levin 1992 full title with the MacArthur Award Lecture subtitle; Krenke
  2019 English title as registered with the DOI.
- Issue ranges with en dash; footnote no longer cites table 2 before table 1.

Co-Authored-By: Claude Fable 5.1 <noreply@anthropic.com>
</commit_message>
<xml_diff>
--- a/manuscript_v2/article1_v7.docx
+++ b/manuscript_v2/article1_v7.docx
@@ -5831,21 +5831,21 @@
           <w:iCs/>
           <w:sz w:val="24"/>
         </w:rPr>
-        <w:t xml:space="preserve">Bolgiani P., Calvo-Sancho C., Díaz-Fernández J., et al.</w:t>
-      </w:r>
-      <w:r>
-        <w:rPr>
-          <w:rFonts w:ascii="Times New Roman" w:hAnsi="Times New Roman"/>
-          <w:sz w:val="24"/>
-        </w:rPr>
-        <w:t xml:space="preserve"> </w:t>
-      </w:r>
-      <w:r>
-        <w:rPr>
-          <w:rFonts w:ascii="Times New Roman" w:hAnsi="Times New Roman"/>
-          <w:sz w:val="24"/>
-        </w:rPr>
-        <w:t xml:space="preserve">Wind kinetic energy climatology and effective resolution for the ERA5 reanalysis // Clim. Dyn. 2022. Vol. 59. № 3-4. P. 737–752. doi: 10.1007/s00382-022-06154-y</w:t>
+        <w:t xml:space="preserve">Bolgiani P., Calvo-Sancho C., Díaz-Fernández J., Quitián-Hernández L., Sastre M., Santos-Muñoz D., Farrán J.I., González-Alemán J.J., Valero F., Martín M.L.</w:t>
+      </w:r>
+      <w:r>
+        <w:rPr>
+          <w:rFonts w:ascii="Times New Roman" w:hAnsi="Times New Roman"/>
+          <w:sz w:val="24"/>
+        </w:rPr>
+        <w:t xml:space="preserve"> </w:t>
+      </w:r>
+      <w:r>
+        <w:rPr>
+          <w:rFonts w:ascii="Times New Roman" w:hAnsi="Times New Roman"/>
+          <w:sz w:val="24"/>
+        </w:rPr>
+        <w:t xml:space="preserve">Wind kinetic energy climatology and effective resolution for the ERA5 reanalysis // Clim. Dyn. 2022. Vol. 59. № 3–4. P. 737–752. doi: 10.1007/s00382-022-06154-y</w:t>
       </w:r>
     </w:p>
     <w:p>
@@ -5915,7 +5915,7 @@
           <w:iCs/>
           <w:sz w:val="24"/>
         </w:rPr>
-        <w:t xml:space="preserve">Canolty R.T., Edwards E., Dalal S.S., et al.</w:t>
+        <w:t xml:space="preserve">Canolty R.T., Edwards E., Dalal S.S., Soltani M., Nagarajan S.S., Kirsch H.E., Berger M.S., Barbaro N.M., Knight R.T.</w:t>
       </w:r>
       <w:r>
         <w:rPr>
@@ -6013,7 +6013,7 @@
           <w:rFonts w:ascii="Times New Roman" w:hAnsi="Times New Roman"/>
           <w:sz w:val="24"/>
         </w:rPr>
-        <w:t xml:space="preserve">Wavelet transforms and their applications to turbulence // Annu. Rev. Fluid Mech. 1992. Vol. 24. № 1. P. 395–457. doi: 10.1146/annurev.fl.24.010192.002143</w:t>
+        <w:t xml:space="preserve">Wavelet transforms and their applications to turbulence // Annu. Rev. Fluid Mech. 1992. Vol. 24. № 1. P. 395–458. doi: 10.1146/annurev.fl.24.010192.002143</w:t>
       </w:r>
     </w:p>
     <w:p>
@@ -6237,7 +6237,7 @@
           <w:rFonts w:ascii="Times New Roman" w:hAnsi="Times New Roman"/>
           <w:sz w:val="24"/>
         </w:rPr>
-        <w:t xml:space="preserve">The problem of pattern and scale in ecology // Ecology. 1992. Vol. 73. № 6. P. 1943–1967. doi: 10.2307/1941447</w:t>
+        <w:t xml:space="preserve">The problem of pattern and scale in ecology: The Robert H. MacArthur Award Lecture // Ecology. 1992. Vol. 73. № 6. P. 1943–1967. doi: 10.2307/1941447</w:t>
       </w:r>
     </w:p>
     <w:p>
@@ -6503,7 +6503,7 @@
           <w:iCs/>
           <w:sz w:val="24"/>
         </w:rPr>
-        <w:t xml:space="preserve">Price I., Sanchez-Gonzalez A., Alet F., et al.</w:t>
+        <w:t xml:space="preserve">Price I., Sanchez-Gonzalez A., Alet F., Andersson T.R., El-Kadi A., Masters D., Ewalds T., Stott J., Mohamed S., Battaglia P., Lam R., Willson M.</w:t>
       </w:r>
       <w:r>
         <w:rPr>
@@ -6998,7 +6998,7 @@
           <w:rFonts w:ascii="Times New Roman" w:hAnsi="Times New Roman"/>
           <w:sz w:val="24"/>
         </w:rPr>
-        <w:t xml:space="preserve">Bolgiani P., Calvo-Sancho C., Díaz-Fernández J., et al. Wind kinetic energy climatology and effective resolution for the ERA5 reanalysis.</w:t>
+        <w:t xml:space="preserve">Bolgiani P., Calvo-Sancho C., Díaz-Fernández J., Quitián-Hernández L., Sastre M., Santos-Muñoz D., Farrán J.I., González-Alemán J.J., Valero F., Martín M.L. Wind kinetic energy climatology and effective resolution for the ERA5 reanalysis.</w:t>
       </w:r>
       <w:r>
         <w:rPr>
@@ -7021,7 +7021,7 @@
           <w:rFonts w:ascii="Times New Roman" w:hAnsi="Times New Roman"/>
           <w:sz w:val="24"/>
         </w:rPr>
-        <w:t xml:space="preserve">, 2022, vol. 59, no. 3-4, pp. 737–752.</w:t>
+        <w:t xml:space="preserve">, 2022, vol. 59, no. 3–4, pp. 737–752.</w:t>
       </w:r>
       <w:r>
         <w:rPr>
@@ -7145,7 +7145,7 @@
           <w:rFonts w:ascii="Times New Roman" w:hAnsi="Times New Roman"/>
           <w:sz w:val="24"/>
         </w:rPr>
-        <w:t xml:space="preserve">Canolty R.T., Edwards E., Dalal S.S., et al. High gamma power is phase-locked to theta oscillations in human neocortex.</w:t>
+        <w:t xml:space="preserve">Canolty R.T., Edwards E., Dalal S.S., Soltani M., Nagarajan S.S., Kirsch H.E., Berger M.S., Barbaro N.M., Knight R.T. High gamma power is phase-locked to theta oscillations in human neocortex.</w:t>
       </w:r>
       <w:r>
         <w:rPr>
@@ -7315,7 +7315,7 @@
           <w:rFonts w:ascii="Times New Roman" w:hAnsi="Times New Roman"/>
           <w:sz w:val="24"/>
         </w:rPr>
-        <w:t xml:space="preserve">, 1992, vol. 24, no. 1, pp. 395–457.</w:t>
+        <w:t xml:space="preserve">, 1992, vol. 24, no. 1, pp. 395–458.</w:t>
       </w:r>
       <w:r>
         <w:rPr>
@@ -7635,7 +7635,7 @@
           <w:rFonts w:ascii="Times New Roman" w:hAnsi="Times New Roman"/>
           <w:sz w:val="24"/>
         </w:rPr>
-        <w:t xml:space="preserve">Krenke A.N., Puzachenko Yu.G., Puzachenko M.Yu. Spatial organization of the regional mesoclimate.</w:t>
+        <w:t xml:space="preserve">Krenke A.N., Puzachenko Yu.G., Puzachenko M.Yu. Spatial organization of regional mesoclimate.</w:t>
       </w:r>
       <w:r>
         <w:rPr>
@@ -7733,7 +7733,7 @@
           <w:rFonts w:ascii="Times New Roman" w:hAnsi="Times New Roman"/>
           <w:sz w:val="24"/>
         </w:rPr>
-        <w:t xml:space="preserve">Levin S.A. The problem of pattern and scale in ecology.</w:t>
+        <w:t xml:space="preserve">Levin S.A. The problem of pattern and scale in ecology: The Robert H. MacArthur Award Lecture.</w:t>
       </w:r>
       <w:r>
         <w:rPr>
@@ -8223,7 +8223,7 @@
           <w:rFonts w:ascii="Times New Roman" w:hAnsi="Times New Roman"/>
           <w:sz w:val="24"/>
         </w:rPr>
-        <w:t xml:space="preserve">Price I., Sanchez-Gonzalez A., Alet F., et al. Probabilistic weather forecasting with machine learning.</w:t>
+        <w:t xml:space="preserve">Price I., Sanchez-Gonzalez A., Alet F., Andersson T.R., El-Kadi A., Masters D., Ewalds T., Stott J., Mohamed S., Battaglia P., Lam R., Willson M. Probabilistic weather forecasting with machine learning.</w:t>
       </w:r>
       <w:r>
         <w:rPr>
@@ -12680,7 +12680,7 @@
         <w:t xml:space="preserve"> </w:t>
       </w:r>
       <w:r>
-        <w:t xml:space="preserve">https://github.com/Theclimateguy/Shroedinger (дата обращения 14.09.2026); постоянный архив версий – Zenodo, doi: 10.5281/zenodo.19565769. Маршрут воспроизведения каждой строки табл. 2 описан в файле reproducibility/article1_README.md.</w:t>
+        <w:t xml:space="preserve">https://github.com/Theclimateguy/Shroedinger (дата обращения 14.09.2026); постоянный архив версий – Zenodo, doi: 10.5281/zenodo.19565769. Маршрут воспроизведения каждой проверки описан в файле reproducibility/article1_README.md.</w:t>
       </w:r>
     </w:p>
   </w:footnote>

</xml_diff>

<commit_message>
Article 1 v7: figure 2 redrawn with Russian labels; affiliation Moscow
- clean_experiments/visualize_B18_geometry_ru.py rebuilds the degree-vs-
  equal-km anchored-profile panels from B3 and B18 per-window results.
- Affiliation: Независимый исследователь, Москва, Россия / Moscow, Russia.

Co-Authored-By: Claude Fable 5.1 <noreply@anthropic.com>
</commit_message>
<xml_diff>
--- a/manuscript_v2/article1_v7.docx
+++ b/manuscript_v2/article1_v7.docx
@@ -61,7 +61,7 @@
           <w:rFonts w:ascii="Times New Roman" w:hAnsi="Times New Roman"/>
           <w:sz w:val="24"/>
         </w:rPr>
-        <w:t xml:space="preserve">Независимый исследователь, [город], Россия</w:t>
+        <w:t xml:space="preserve">Независимый исследователь, Москва, Россия</w:t>
       </w:r>
     </w:p>
     <w:p>
@@ -11925,7 +11925,7 @@
         </w:rPr>
         <w:drawing>
           <wp:inline>
-            <wp:extent cx="5334000" cy="3000375"/>
+            <wp:extent cx="5334000" cy="3200400"/>
             <wp:effectExtent b="0" l="0" r="0" t="0"/>
             <wp:docPr descr="image" title="" id="30" name="Picture"/>
             <a:graphic>
@@ -11946,7 +11946,7 @@
                   <pic:spPr bwMode="auto">
                     <a:xfrm>
                       <a:off x="0" y="0"/>
-                      <a:ext cx="5334000" cy="3000375"/>
+                      <a:ext cx="5334000" cy="3200400"/>
                     </a:xfrm>
                     <a:prstGeom prst="rect">
                       <a:avLst/>
@@ -12098,28 +12098,7 @@
           <w:rFonts w:ascii="Times New Roman" w:hAnsi="Times New Roman"/>
           <w:sz w:val="24"/>
         </w:rPr>
-        <w:t xml:space="preserve">(синий,</w:t>
-      </w:r>
-      <w:r>
-        <w:rPr>
-          <w:rFonts w:ascii="Times New Roman" w:hAnsi="Times New Roman"/>
-          <w:sz w:val="24"/>
-        </w:rPr>
-        <w:t xml:space="preserve"> </w:t>
-      </w:r>
-      <w:r>
-        <w:rPr>
-          <w:rFonts w:ascii="Times New Roman" w:hAnsi="Times New Roman"/>
-          <w:sz w:val="24"/>
-        </w:rPr>
-        <w:t xml:space="preserve">“degree”</w:t>
-      </w:r>
-      <w:r>
-        <w:rPr>
-          <w:rFonts w:ascii="Times New Roman" w:hAnsi="Times New Roman"/>
-          <w:sz w:val="24"/>
-        </w:rPr>
-        <w:t xml:space="preserve">) и на равновеликих областях</w:t>
+        <w:t xml:space="preserve">(синий) и на равновеликих областях</w:t>
       </w:r>
       <w:r>
         <w:rPr>
@@ -12154,28 +12133,7 @@
           <w:rFonts w:ascii="Times New Roman" w:hAnsi="Times New Roman"/>
           <w:sz w:val="24"/>
         </w:rPr>
-        <w:t xml:space="preserve">км (красный,</w:t>
-      </w:r>
-      <w:r>
-        <w:rPr>
-          <w:rFonts w:ascii="Times New Roman" w:hAnsi="Times New Roman"/>
-          <w:sz w:val="24"/>
-        </w:rPr>
-        <w:t xml:space="preserve"> </w:t>
-      </w:r>
-      <w:r>
-        <w:rPr>
-          <w:rFonts w:ascii="Times New Roman" w:hAnsi="Times New Roman"/>
-          <w:sz w:val="24"/>
-        </w:rPr>
-        <w:t xml:space="preserve">“km”</w:t>
-      </w:r>
-      <w:r>
-        <w:rPr>
-          <w:rFonts w:ascii="Times New Roman" w:hAnsi="Times New Roman"/>
-          <w:sz w:val="24"/>
-        </w:rPr>
-        <w:t xml:space="preserve">) для двенадцати регионов, 48 основных регион-окон 2023–2024 гг. Полосы – размах по окнам; в заголовках панелей – ранговая корреляция профилей двух нарезок по региону; по оси абсцисс – полосы ступеней, км.</w:t>
+        <w:t xml:space="preserve">км (красный) для двенадцати регионов, 48 основных регион-окон 2023–2024 гг. Полосы – размах по окнам; в заголовках панелей – ранговая корреляция профилей двух нарезок по региону; по оси абсцисс – полосы ступеней, км.</w:t>
       </w:r>
     </w:p>
     <w:p>
@@ -12459,7 +12417,7 @@
           <w:rFonts w:ascii="Times New Roman" w:hAnsi="Times New Roman"/>
           <w:sz w:val="24"/>
         </w:rPr>
-        <w:t xml:space="preserve">Independent researcher, [City], Russia</w:t>
+        <w:t xml:space="preserve">Independent researcher, Moscow, Russia</w:t>
       </w:r>
     </w:p>
     <w:p>

</xml_diff>